<commit_message>
docs(ad-tests): custos de imagem com valor real medido em um cliente (Unica, 22 anuncios)
Troca a derivacao por tabela de preco pelo consumo registrado no ledger
gemini_usage (jobs 297-318, company 297): US$ 0,082 por anuncio.
Estimativa de video/audio reancorada no volume real desse cliente.

Co-Authored-By: Claude Opus 5 (1M context) <noreply@anthropic.com>
</commit_message>
<xml_diff>
--- a/ad-tests/dados-e-metricas.docx
+++ b/ad-tests/dados-e-metricas.docx
@@ -1098,7 +1098,7 @@
         <w:rPr>
           <w:rtl w:val="0"/>
         </w:rPr>
-        <w:t xml:space="preserve">Imagem — medido na nossa API</w:t>
+        <w:t xml:space="preserve">Imagem — medido em um cliente</w:t>
       </w:r>
     </w:p>
     <w:p>
@@ -1110,32 +1110,32 @@
         <w:rPr>
           <w:rtl w:val="0"/>
         </w:rPr>
-        <w:t xml:space="preserve">Um banner é uma sequência de chamadas. A geração da imagem é quase tudo; o resto é planejamento e diagramação.</w:t>
-      </w:r>
-    </w:p>
-    <w:p>
-      <w:pPr>
-        <w:numPr>
-          <w:ilvl w:val="0"/>
-          <w:numId w:val="1"/>
-        </w:numPr>
-        <w:spacing w:after="60" w:before="0" w:lineRule="auto"/>
-        <w:ind w:left="360" w:hanging="360"/>
-        <w:rPr/>
-      </w:pPr>
-      <w:r>
-        <w:rPr>
-          <w:b w:val="1"/>
-          <w:bCs w:val="1"/>
-          <w:rtl w:val="0"/>
-        </w:rPr>
-        <w:t xml:space="preserve">Fundo gerado</w:t>
-      </w:r>
-      <w:r>
-        <w:rPr>
-          <w:rtl w:val="0"/>
-        </w:rPr>
-        <w:t xml:space="preserve"> — US$ 0,067 por banner. Três quartos do custo.</w:t>
+        <w:t xml:space="preserve">Base: a Unica, 22 anúncios gerados entre 4 e 6 de agosto de 2026. Consumo lido do nosso próprio registro, não estimativa. São 146 chamadas de modelo e US$ 1,79 no total.</w:t>
+      </w:r>
+    </w:p>
+    <w:p>
+      <w:pPr>
+        <w:numPr>
+          <w:ilvl w:val="0"/>
+          <w:numId w:val="1"/>
+        </w:numPr>
+        <w:spacing w:after="60" w:before="0" w:lineRule="auto"/>
+        <w:ind w:left="360" w:hanging="360"/>
+        <w:rPr/>
+      </w:pPr>
+      <w:r>
+        <w:rPr>
+          <w:b w:val="1"/>
+          <w:bCs w:val="1"/>
+          <w:rtl w:val="0"/>
+        </w:rPr>
+        <w:t xml:space="preserve">Geração da imagem</w:t>
+      </w:r>
+      <w:r>
+        <w:rPr>
+          <w:rtl w:val="0"/>
+        </w:rPr>
+        <w:t xml:space="preserve"> — US$ 0,0416 por anúncio. Metade do custo, numa única chamada.</w:t>
       </w:r>
     </w:p>
     <w:p>
@@ -1160,57 +1160,7 @@
         <w:rPr>
           <w:rtl w:val="0"/>
         </w:rPr>
-        <w:t xml:space="preserve"> — US$ 0,025, só quando o pedido traz uma.</w:t>
-      </w:r>
-    </w:p>
-    <w:p>
-      <w:pPr>
-        <w:numPr>
-          <w:ilvl w:val="0"/>
-          <w:numId w:val="1"/>
-        </w:numPr>
-        <w:spacing w:after="60" w:before="0" w:lineRule="auto"/>
-        <w:ind w:left="360" w:hanging="360"/>
-        <w:rPr/>
-      </w:pPr>
-      <w:r>
-        <w:rPr>
-          <w:b w:val="1"/>
-          <w:bCs w:val="1"/>
-          <w:rtl w:val="0"/>
-        </w:rPr>
-        <w:t xml:space="preserve">Copy, tema e leitura da marca</w:t>
-      </w:r>
-      <w:r>
-        <w:rPr>
-          <w:rtl w:val="0"/>
-        </w:rPr>
-        <w:t xml:space="preserve"> — US$ 0,010 por banner.</w:t>
-      </w:r>
-    </w:p>
-    <w:p>
-      <w:pPr>
-        <w:numPr>
-          <w:ilvl w:val="0"/>
-          <w:numId w:val="1"/>
-        </w:numPr>
-        <w:spacing w:after="60" w:before="0" w:lineRule="auto"/>
-        <w:ind w:left="360" w:hanging="360"/>
-        <w:rPr/>
-      </w:pPr>
-      <w:r>
-        <w:rPr>
-          <w:b w:val="1"/>
-          <w:bCs w:val="1"/>
-          <w:rtl w:val="0"/>
-        </w:rPr>
-        <w:t xml:space="preserve">Diagramação do título, do botão e do logo</w:t>
-      </w:r>
-      <w:r>
-        <w:rPr>
-          <w:rtl w:val="0"/>
-        </w:rPr>
-        <w:t xml:space="preserve"> — US$ 0,005 por banner.</w:t>
+        <w:t xml:space="preserve"> — US$ 0,0315 por anúncio. Quase 40% do custo.</w:t>
       </w:r>
     </w:p>
     <w:p>
@@ -1229,13 +1179,13 @@
           <w:bCs w:val="1"/>
           <w:rtl w:val="0"/>
         </w:rPr>
-        <w:t xml:space="preserve">Escolha da área livre para o texto</w:t>
-      </w:r>
-      <w:r>
-        <w:rPr>
-          <w:rtl w:val="0"/>
-        </w:rPr>
-        <w:t xml:space="preserve"> — US$ 0,0035 por banner.</w:t>
+        <w:t xml:space="preserve">Copy, tema e diagramação</w:t>
+      </w:r>
+      <w:r>
+        <w:rPr>
+          <w:rtl w:val="0"/>
+        </w:rPr>
+        <w:t xml:space="preserve"> — US$ 0,0085 por anúncio, divididos em quase cinco chamadas.</w:t>
       </w:r>
     </w:p>
     <w:p>
@@ -1252,13 +1202,13 @@
           <w:bCs w:val="1"/>
           <w:rtl w:val="0"/>
         </w:rPr>
-        <w:t xml:space="preserve">Banner pronto: US$ 0,09 sem referência, US$ 0,12 com referência.</w:t>
-      </w:r>
-      <w:r>
-        <w:rPr>
-          <w:rtl w:val="0"/>
-        </w:rPr>
-        <w:t xml:space="preserve"> Doze posts no mês custam de US$ 1,10 a US$ 1,40, ou R$ 6 a R$ 7,60.</w:t>
+        <w:t xml:space="preserve">Um anúncio custa US$ 0,082, ou R$ 0,44.</w:t>
+      </w:r>
+      <w:r>
+        <w:rPr>
+          <w:rtl w:val="0"/>
+        </w:rPr>
+        <w:t xml:space="preserve"> Os 22 ficaram entre US$ 0,074 e US$ 0,090.</w:t>
       </w:r>
     </w:p>
     <w:p>
@@ -1270,7 +1220,7 @@
         <w:rPr>
           <w:rtl w:val="0"/>
         </w:rPr>
-        <w:t xml:space="preserve">Imagem é cerca de quarenta vezes tudo o que o cliente gasta em texto no mês. É o único custo que cresce com o volume de posts; o resto praticamente não se mexe.</w:t>
+        <w:t xml:space="preserve">Doze posts no mês dão US$ 0,98, ou R$ 5,30 por cliente. É trinta vezes tudo o que o cliente gasta em texto no mesmo mês, e o único custo que cresce com o volume de posts.</w:t>
       </w:r>
     </w:p>
     <w:p>
@@ -1282,7 +1232,7 @@
         <w:rPr>
           <w:rtl w:val="0"/>
         </w:rPr>
-        <w:t xml:space="preserve">O detector de texto queimado está desligado desde julho, por decisão de custo. Religar acrescenta menos de um centavo por banner, mais uma geração inteira toda vez que reprova.</w:t>
+        <w:t xml:space="preserve">Entender a imagem de referência custa quase o mesmo que gerar a imagem final. Todo anúncio da Unica foi gerado com referência; sem ela o anúncio cairia para cerca de US$ 0,05. Vale medir antes de decidir se a referência é obrigatória.</w:t>
       </w:r>
     </w:p>
     <w:p>
@@ -1307,7 +1257,7 @@
         <w:rPr>
           <w:rtl w:val="0"/>
         </w:rPr>
-        <w:t xml:space="preserve">Não existe no produto ainda. Preço de tabela do Google em agosto de 2026, para dimensionar a decisão.</w:t>
+        <w:t xml:space="preserve">Não existe no produto. Preço de tabela do Google em agosto de 2026, aplicado ao volume real da Unica.</w:t>
       </w:r>
     </w:p>
     <w:p>
@@ -1357,32 +1307,7 @@
         <w:rPr>
           <w:rtl w:val="0"/>
         </w:rPr>
-        <w:t xml:space="preserve"> — US$ 0,08. É o mesmo pipeline do banner.</w:t>
-      </w:r>
-    </w:p>
-    <w:p>
-      <w:pPr>
-        <w:numPr>
-          <w:ilvl w:val="0"/>
-          <w:numId w:val="1"/>
-        </w:numPr>
-        <w:spacing w:after="60" w:before="0" w:lineRule="auto"/>
-        <w:ind w:left="360" w:hanging="360"/>
-        <w:rPr/>
-      </w:pPr>
-      <w:r>
-        <w:rPr>
-          <w:b w:val="1"/>
-          <w:bCs w:val="1"/>
-          <w:rtl w:val="0"/>
-        </w:rPr>
-        <w:t xml:space="preserve">Regeneração</w:t>
-      </w:r>
-      <w:r>
-        <w:rPr>
-          <w:rtl w:val="0"/>
-        </w:rPr>
-        <w:t xml:space="preserve"> — conte uma a cada três tentativas. Vídeo erra mais que imagem e não dá para consertar na diagramação.</w:t>
+        <w:t xml:space="preserve"> — US$ 0,05 por vídeo. É o mesmo pipeline do anúncio.</w:t>
       </w:r>
     </w:p>
     <w:p>
@@ -1424,13 +1349,13 @@
           <w:bCs w:val="1"/>
           <w:rtl w:val="0"/>
         </w:rPr>
-        <w:t xml:space="preserve">Um vídeo de 8 segundos sai entre US$ 0,90 e US$ 4,30.</w:t>
-      </w:r>
-      <w:r>
-        <w:rPr>
-          <w:rtl w:val="0"/>
-        </w:rPr>
-        <w:t xml:space="preserve"> Um Reels de 15 segundos custa o dobro: são dois clipes.</w:t>
+        <w:t xml:space="preserve">Um vídeo de 8 segundos equivale a oito anúncios no tier barato e a quarenta no caro.</w:t>
+      </w:r>
+      <w:r>
+        <w:rPr>
+          <w:rtl w:val="0"/>
+        </w:rPr>
+        <w:t xml:space="preserve"> No Fast, doze.</w:t>
       </w:r>
     </w:p>
     <w:p>
@@ -1442,7 +1367,7 @@
         <w:rPr>
           <w:rtl w:val="0"/>
         </w:rPr>
-        <w:t xml:space="preserve">Um vídeo equivale a oito banners no tier mais barato e a trinta e seis no mais caro. Quatro vídeos por mês no Fast dão US$ 5,40, o triplo de um mês inteiro de imagens. Vídeo é o único item capaz de mudar a ordem de grandeza do custo por cliente. Áudio é ruído na conta.</w:t>
+        <w:t xml:space="preserve">Se quatro dos doze posts do mês virarem vídeo, o cliente sai de US$ 0,98 para US$ 3,40 no Lite, US$ 4,70 no Fast e US$ 13,70 no Standard. Áudio não move o ponteiro: quatro locuções de 30 segundos custam 4 centavos. Vídeo é o único item capaz de mudar a ordem de grandeza do custo por cliente.</w:t>
       </w:r>
     </w:p>
     <w:p>
@@ -1505,7 +1430,7 @@
         <w:rPr>
           <w:rtl w:val="0"/>
         </w:rPr>
-        <w:t xml:space="preserve"> e não se atualizam sozinhos. Conferir antes de usar em proposta comercial.</w:t>
+        <w:t xml:space="preserve"> e não se atualizam sozinhos. Conferir antes de usar em proposta comercial. Os números de imagem são a exceção: vêm do consumo registrado de um cliente real.</w:t>
       </w:r>
     </w:p>
     <w:p>

</xml_diff>

<commit_message>
fix(ads): pickCalmTextZone estava morto — thinkingBudget e ignorado no Gemini 3
Desde 08/07 o pickCalmTextZone chamava gemini-3-pro-preview passando
thinkingBudget:0, que o callGemini so encaminha para modelos gemini-2.5.
Sem thinkingConfig o 3-pro cai no thinking padrao e o cap de 64 tokens era
consumido antes de qualquer resposta — zero linhas de gemini-3-pro-preview no
ledger gemini_usage desde que ele existe. O catch devolvia null e o overlay
montava o anuncio sem nenhuma analise de area calma.

Troca para thinkingLevel:low (mesmo padrao do backgroundHasText) e sobe o
maxOutputTokens de 64 para 512, dando folga aos tokens de thinking.

Doc atualizado: a medicao dos 22 anuncios da Unica saiu com essa etapa morta;
o retorno dela projeta +US$ 0,006 por anuncio.

Co-Authored-By: Claude Opus 5 (1M context) <noreply@anthropic.com>
</commit_message>
<xml_diff>
--- a/ad-tests/dados-e-metricas.docx
+++ b/ad-tests/dados-e-metricas.docx
@@ -1233,6 +1233,18 @@
           <w:rtl w:val="0"/>
         </w:rPr>
         <w:t xml:space="preserve">Entender a imagem de referência custa quase o mesmo que gerar a imagem final. Todo anúncio da Unica foi gerado com referência; sem ela o anúncio cairia para cerca de US$ 0,05. Vale medir antes de decidir se a referência é obrigatória.</w:t>
+      </w:r>
+    </w:p>
+    <w:p>
+      <w:pPr>
+        <w:spacing w:after="140" w:before="0" w:lineRule="auto"/>
+        <w:rPr/>
+      </w:pPr>
+      <w:r>
+        <w:rPr>
+          <w:rtl w:val="0"/>
+        </w:rPr>
+        <w:t xml:space="preserve">A medição pegou uma etapa morta. A análise que escolhe a área livre para o texto falhava em silêncio desde julho, então esses 22 anúncios saíram sem ela — foi assim que a descobrimos, procurando no registro de consumo um modelo que o código chama e que nunca aparecia. Corrigida em 7 de agosto. Ela volta a custar cerca de US$ 0,006 por anúncio, o que leva o total para US$ 0,088. Esse número ainda é projeção; o resto da seção é medição.</w:t>
       </w:r>
     </w:p>
     <w:p>

</xml_diff>

<commit_message>
test(ads): run 274 confirma calm zone viva; doc com custo medido de US$ 0,088
Job 320, payload identico ao 273: 2 chamadas de gemini-3.5-flash (era 1) e 8
totais (era 7). A etapa custa ~US$ 0,0097 e mudou o layout de hero-full-bleed
para bold-headline-first — headline saiu de cima das pessoas.

Documento atualizado: a projecao de US$ 0,088 virou medicao, com a etapa da
area calma listada e a historia da chamada morta contada na secao de custos.

Co-Authored-By: Claude Opus 5 (1M context) <noreply@anthropic.com>
</commit_message>
<xml_diff>
--- a/ad-tests/dados-e-metricas.docx
+++ b/ad-tests/dados-e-metricas.docx
@@ -1110,7 +1110,7 @@
         <w:rPr>
           <w:rtl w:val="0"/>
         </w:rPr>
-        <w:t xml:space="preserve">Base: a Unica, 22 anúncios gerados entre 4 e 6 de agosto de 2026. Consumo lido do nosso próprio registro, não estimativa. São 146 chamadas de modelo e US$ 1,79 no total.</w:t>
+        <w:t xml:space="preserve">Base: a Unica, 24 anúncios gerados entre 4 e 7 de agosto de 2026. Consumo lido do nosso próprio registro, não estimativa. Os valores por etapa são do último anúncio, já com a correção descrita mais abaixo.</w:t>
       </w:r>
     </w:p>
     <w:p>
@@ -1135,7 +1135,7 @@
         <w:rPr>
           <w:rtl w:val="0"/>
         </w:rPr>
-        <w:t xml:space="preserve"> — US$ 0,0416 por anúncio. Metade do custo, numa única chamada.</w:t>
+        <w:t xml:space="preserve"> — US$ 0,0418 por anúncio. Metade do custo, numa única chamada.</w:t>
       </w:r>
     </w:p>
     <w:p>
@@ -1160,7 +1160,32 @@
         <w:rPr>
           <w:rtl w:val="0"/>
         </w:rPr>
-        <w:t xml:space="preserve"> — US$ 0,0315 por anúncio. Quase 40% do custo.</w:t>
+        <w:t xml:space="preserve"> — US$ 0,0287 por anúncio. Um terço do custo.</w:t>
+      </w:r>
+    </w:p>
+    <w:p>
+      <w:pPr>
+        <w:numPr>
+          <w:ilvl w:val="0"/>
+          <w:numId w:val="1"/>
+        </w:numPr>
+        <w:spacing w:after="60" w:before="0" w:lineRule="auto"/>
+        <w:ind w:left="360" w:hanging="360"/>
+        <w:rPr/>
+      </w:pPr>
+      <w:r>
+        <w:rPr>
+          <w:b w:val="1"/>
+          <w:bCs w:val="1"/>
+          <w:rtl w:val="0"/>
+        </w:rPr>
+        <w:t xml:space="preserve">Escolha da área livre para o texto</w:t>
+      </w:r>
+      <w:r>
+        <w:rPr>
+          <w:rtl w:val="0"/>
+        </w:rPr>
+        <w:t xml:space="preserve"> — US$ 0,0097 por anúncio.</w:t>
       </w:r>
     </w:p>
     <w:p>
@@ -1185,7 +1210,7 @@
         <w:rPr>
           <w:rtl w:val="0"/>
         </w:rPr>
-        <w:t xml:space="preserve"> — US$ 0,0085 por anúncio, divididos em quase cinco chamadas.</w:t>
+        <w:t xml:space="preserve"> — US$ 0,0079 por anúncio, divididos em cinco chamadas.</w:t>
       </w:r>
     </w:p>
     <w:p>
@@ -1202,13 +1227,13 @@
           <w:bCs w:val="1"/>
           <w:rtl w:val="0"/>
         </w:rPr>
-        <w:t xml:space="preserve">Um anúncio custa US$ 0,082, ou R$ 0,44.</w:t>
-      </w:r>
-      <w:r>
-        <w:rPr>
-          <w:rtl w:val="0"/>
-        </w:rPr>
-        <w:t xml:space="preserve"> Os 22 ficaram entre US$ 0,074 e US$ 0,090.</w:t>
+        <w:t xml:space="preserve">Um anúncio custa US$ 0,088, ou R$ 0,48.</w:t>
+      </w:r>
+      <w:r>
+        <w:rPr>
+          <w:rtl w:val="0"/>
+        </w:rPr>
+        <w:t xml:space="preserve"> A faixa observada vai de US$ 0,074 a US$ 0,090.</w:t>
       </w:r>
     </w:p>
     <w:p>
@@ -1220,7 +1245,7 @@
         <w:rPr>
           <w:rtl w:val="0"/>
         </w:rPr>
-        <w:t xml:space="preserve">Doze posts no mês dão US$ 0,98, ou R$ 5,30 por cliente. É trinta vezes tudo o que o cliente gasta em texto no mesmo mês, e o único custo que cresce com o volume de posts.</w:t>
+        <w:t xml:space="preserve">Doze posts no mês dão US$ 1,06, ou R$ 5,70 por cliente. É trinta e cinco vezes tudo o que o cliente gasta em texto no mesmo mês, e o único custo que cresce com o volume de posts.</w:t>
       </w:r>
     </w:p>
     <w:p>
@@ -1232,7 +1257,7 @@
         <w:rPr>
           <w:rtl w:val="0"/>
         </w:rPr>
-        <w:t xml:space="preserve">Entender a imagem de referência custa quase o mesmo que gerar a imagem final. Todo anúncio da Unica foi gerado com referência; sem ela o anúncio cairia para cerca de US$ 0,05. Vale medir antes de decidir se a referência é obrigatória.</w:t>
+        <w:t xml:space="preserve">Entender a imagem de referência custa quase o mesmo que gerar a imagem final. Todo anúncio da Unica foi gerado com referência; sem ela o anúncio cairia para cerca de US$ 0,06. Vale medir antes de decidir se a referência é obrigatória.</w:t>
       </w:r>
     </w:p>
     <w:p>
@@ -1244,7 +1269,7 @@
         <w:rPr>
           <w:rtl w:val="0"/>
         </w:rPr>
-        <w:t xml:space="preserve">A medição pegou uma etapa morta. A análise que escolhe a área livre para o texto falhava em silêncio desde julho, então esses 22 anúncios saíram sem ela — foi assim que a descobrimos, procurando no registro de consumo um modelo que o código chama e que nunca aparecia. Corrigida em 7 de agosto. Ela volta a custar cerca de US$ 0,006 por anúncio, o que leva o total para US$ 0,088. Esse número ainda é projeção; o resto da seção é medição.</w:t>
+        <w:t xml:space="preserve">A medição encontrou uma etapa morta. A análise que escolhe a área livre para o texto tinha parado de funcionar em silêncio: o modelo que ela usava foi aposentado pelo Google e a chamada passou a falhar sem avisar, então os primeiros 22 anúncios saíram com o texto posicionado no escuro. Foi o próprio registro de consumo que denunciou — um modelo que o código chama e que nunca aparecia na conta. Corrigida em 7 de agosto: a etapa voltou, custa US$ 0,0097 por anúncio e levou o total de US$ 0,082 para US$ 0,088. Os dois valores são medidos.</w:t>
       </w:r>
     </w:p>
     <w:p>
@@ -1361,7 +1386,7 @@
           <w:bCs w:val="1"/>
           <w:rtl w:val="0"/>
         </w:rPr>
-        <w:t xml:space="preserve">Um vídeo de 8 segundos equivale a oito anúncios no tier barato e a quarenta no caro.</w:t>
+        <w:t xml:space="preserve">Um vídeo de 8 segundos equivale a oito anúncios no tier barato e a quase quarenta no caro.</w:t>
       </w:r>
       <w:r>
         <w:rPr>
@@ -1379,7 +1404,7 @@
         <w:rPr>
           <w:rtl w:val="0"/>
         </w:rPr>
-        <w:t xml:space="preserve">Se quatro dos doze posts do mês virarem vídeo, o cliente sai de US$ 0,98 para US$ 3,40 no Lite, US$ 4,70 no Fast e US$ 13,70 no Standard. Áudio não move o ponteiro: quatro locuções de 30 segundos custam 4 centavos. Vídeo é o único item capaz de mudar a ordem de grandeza do custo por cliente.</w:t>
+        <w:t xml:space="preserve">Se quatro dos doze posts do mês virarem vídeo, o cliente sai de US$ 1,06 para US$ 3,50 no Lite, US$ 4,70 no Fast e US$ 13,70 no Standard. Áudio não move o ponteiro: quatro locuções de 30 segundos custam 4 centavos. Vídeo é o único item capaz de mudar a ordem de grandeza do custo por cliente.</w:t>
       </w:r>
     </w:p>
     <w:p>

</xml_diff>

<commit_message>
docs(ad-tests): fecha o total por cliente somando texto + imagem
O documento tinha o onboarding (US$ 0,35) e a imagem em secoes separadas, sem
ninguem somar as duas. Nova secao "O total por cliente": US$ 1,41 no primeiro
mes e US$ 1,09 nos seguintes, para 12 posts/mes. 97% da conta recorrente e
imagem — o onboarding, que parecia o gasto principal, equivale a 4 anuncios.

Co-Authored-By: Claude Opus 5 (1M context) <noreply@anthropic.com>
</commit_message>
<xml_diff>
--- a/ad-tests/dados-e-metricas.docx
+++ b/ad-tests/dados-e-metricas.docx
@@ -1270,6 +1270,116 @@
           <w:rtl w:val="0"/>
         </w:rPr>
         <w:t xml:space="preserve">A medição encontrou uma etapa morta. A análise que escolhe a área livre para o texto tinha parado de funcionar em silêncio: o modelo que ela usava foi aposentado pelo Google e a chamada passou a falhar sem avisar, então os primeiros 22 anúncios saíram com o texto posicionado no escuro. Foi o próprio registro de consumo que denunciou — um modelo que o código chama e que nunca aparecia na conta. Corrigida em 7 de agosto: a etapa voltou, custa US$ 0,0097 por anúncio e levou o total de US$ 0,082 para US$ 0,088. Os dois valores são medidos.</w:t>
+      </w:r>
+    </w:p>
+    <w:p>
+      <w:pPr>
+        <w:pStyle w:val="Heading2"/>
+        <w:spacing w:after="120" w:before="200" w:lineRule="auto"/>
+        <w:rPr/>
+      </w:pPr>
+      <w:r>
+        <w:rPr>
+          <w:rtl w:val="0"/>
+        </w:rPr>
+        <w:t xml:space="preserve">O total por cliente</w:t>
+      </w:r>
+    </w:p>
+    <w:p>
+      <w:pPr>
+        <w:spacing w:after="140" w:before="0" w:lineRule="auto"/>
+        <w:rPr/>
+      </w:pPr>
+      <w:r>
+        <w:rPr>
+          <w:rtl w:val="0"/>
+        </w:rPr>
+        <w:t xml:space="preserve">Somando as duas seções acima — as etapas de texto e as de imagem — para um cliente que publica doze posts no mês.</w:t>
+      </w:r>
+    </w:p>
+    <w:p>
+      <w:pPr>
+        <w:numPr>
+          <w:ilvl w:val="0"/>
+          <w:numId w:val="1"/>
+        </w:numPr>
+        <w:spacing w:after="60" w:before="0" w:lineRule="auto"/>
+        <w:ind w:left="360" w:hanging="360"/>
+        <w:rPr/>
+      </w:pPr>
+      <w:r>
+        <w:rPr>
+          <w:b w:val="1"/>
+          <w:bCs w:val="1"/>
+          <w:rtl w:val="0"/>
+        </w:rPr>
+        <w:t xml:space="preserve">Primeiro mês</w:t>
+      </w:r>
+      <w:r>
+        <w:rPr>
+          <w:rtl w:val="0"/>
+        </w:rPr>
+        <w:t xml:space="preserve"> — US$ 1,41, ou R$ 7,70. Entram o onboarding inteiro (US$ 0,35) e os doze anúncios.</w:t>
+      </w:r>
+    </w:p>
+    <w:p>
+      <w:pPr>
+        <w:numPr>
+          <w:ilvl w:val="0"/>
+          <w:numId w:val="1"/>
+        </w:numPr>
+        <w:spacing w:after="180" w:before="0" w:lineRule="auto"/>
+        <w:ind w:left="360" w:hanging="360"/>
+        <w:rPr/>
+      </w:pPr>
+      <w:r>
+        <w:rPr>
+          <w:b w:val="1"/>
+          <w:bCs w:val="1"/>
+          <w:rtl w:val="0"/>
+        </w:rPr>
+        <w:t xml:space="preserve">Meses seguintes</w:t>
+      </w:r>
+      <w:r>
+        <w:rPr>
+          <w:rtl w:val="0"/>
+        </w:rPr>
+        <w:t xml:space="preserve"> — US$ 1,09, ou R$ 5,90. O onboarding não se repete; sobram os anúncios e centavos de texto.</w:t>
+      </w:r>
+    </w:p>
+    <w:p>
+      <w:pPr>
+        <w:pBdr>
+          <w:left w:color="ff5254" w:space="10" w:sz="18" w:val="single"/>
+        </w:pBdr>
+        <w:spacing w:after="200" w:before="80" w:lineRule="auto"/>
+        <w:rPr/>
+      </w:pPr>
+      <w:r>
+        <w:rPr>
+          <w:b w:val="1"/>
+          <w:bCs w:val="1"/>
+          <w:rtl w:val="0"/>
+        </w:rPr>
+        <w:t xml:space="preserve">Um cliente custa menos de dois dólares por mês.</w:t>
+      </w:r>
+      <w:r>
+        <w:rPr>
+          <w:rtl w:val="0"/>
+        </w:rPr>
+        <w:t xml:space="preserve"> Praticamente tudo isso é imagem: 97% da conta recorrente.</w:t>
+      </w:r>
+    </w:p>
+    <w:p>
+      <w:pPr>
+        <w:spacing w:after="140" w:before="0" w:lineRule="auto"/>
+        <w:rPr/>
+      </w:pPr>
+      <w:r>
+        <w:rPr>
+          <w:rtl w:val="0"/>
+        </w:rPr>
+        <w:t xml:space="preserve">O onboarding parecia o gasto principal enquanto a imagem estava de fora da conta. Com ela dentro, ele vira detalhe: paga-se uma vez e equivale a quatro anúncios. O que decide o custo de um cliente é quantos posts ele publica.</w:t>
       </w:r>
     </w:p>
     <w:p>

</xml_diff>

<commit_message>
docs(ad-tests): precos de imagem/video/audio DENTRO da lista de "Quanto custa um cliente"
Estavam so nas subsecoes de detalhe, abaixo da lista — que e onde todo preco do
documento mora. Agora entram como bullets junto dos demais, e a linha de fecho
"Onboarding completo" passa a somar a imagem (o "menos de 3 centavos por mes"
so valia enquanto a imagem estava fora da conta): US$ 1,41 no primeiro mes e
US$ 1,09 nos seguintes. Removida a secao redundante "O total por cliente".

Co-Authored-By: Claude Opus 5 (1M context) <noreply@anthropic.com>
</commit_message>
<xml_diff>
--- a/ad-tests/dados-e-metricas.docx
+++ b/ad-tests/dados-e-metricas.docx
@@ -875,7 +875,7 @@
         <w:rPr>
           <w:rtl w:val="0"/>
         </w:rPr>
-        <w:t xml:space="preserve">Números reais do sistema, etapas de texto. Imagem, vídeo e áudio vêm logo abaixo.</w:t>
+        <w:t xml:space="preserve">Números reais do sistema. Texto e imagem são medidos; vídeo e áudio são estimativa, porque ainda não existem no produto. O detalhe de cada um vem logo abaixo da lista.</w:t>
       </w:r>
     </w:p>
     <w:p>
@@ -1034,6 +1034,81 @@
           <w:ilvl w:val="0"/>
           <w:numId w:val="1"/>
         </w:numPr>
+        <w:spacing w:after="60" w:before="0" w:lineRule="auto"/>
+        <w:ind w:left="360" w:hanging="360"/>
+        <w:rPr/>
+      </w:pPr>
+      <w:r>
+        <w:rPr>
+          <w:b w:val="1"/>
+          <w:bCs w:val="1"/>
+          <w:rtl w:val="0"/>
+        </w:rPr>
+        <w:t xml:space="preserve">Raspagem de perfil</w:t>
+      </w:r>
+      <w:r>
+        <w:rPr>
+          <w:rtl w:val="0"/>
+        </w:rPr>
+        <w:t xml:space="preserve"> — US$ 0,022 por perfil.</w:t>
+      </w:r>
+    </w:p>
+    <w:p>
+      <w:pPr>
+        <w:numPr>
+          <w:ilvl w:val="0"/>
+          <w:numId w:val="1"/>
+        </w:numPr>
+        <w:spacing w:after="60" w:before="0" w:lineRule="auto"/>
+        <w:ind w:left="360" w:hanging="360"/>
+        <w:rPr/>
+      </w:pPr>
+      <w:r>
+        <w:rPr>
+          <w:b w:val="1"/>
+          <w:bCs w:val="1"/>
+          <w:rtl w:val="0"/>
+        </w:rPr>
+        <w:t xml:space="preserve">Anúncio com imagem</w:t>
+      </w:r>
+      <w:r>
+        <w:rPr>
+          <w:rtl w:val="0"/>
+        </w:rPr>
+        <w:t xml:space="preserve"> — US$ 0,088 por anúncio. Medido.</w:t>
+      </w:r>
+    </w:p>
+    <w:p>
+      <w:pPr>
+        <w:numPr>
+          <w:ilvl w:val="0"/>
+          <w:numId w:val="1"/>
+        </w:numPr>
+        <w:spacing w:after="60" w:before="0" w:lineRule="auto"/>
+        <w:ind w:left="360" w:hanging="360"/>
+        <w:rPr/>
+      </w:pPr>
+      <w:r>
+        <w:rPr>
+          <w:b w:val="1"/>
+          <w:bCs w:val="1"/>
+          <w:rtl w:val="0"/>
+        </w:rPr>
+        <w:t xml:space="preserve">Vídeo de 8 segundos</w:t>
+      </w:r>
+      <w:r>
+        <w:rPr>
+          <w:rtl w:val="0"/>
+        </w:rPr>
+        <w:t xml:space="preserve"> — US$ 1,01 por vídeo, estimado. Tier Fast do Veo 3.1, áudio incluso.</w:t>
+      </w:r>
+    </w:p>
+    <w:p>
+      <w:pPr>
+        <w:numPr>
+          <w:ilvl w:val="0"/>
+          <w:numId w:val="1"/>
+        </w:numPr>
         <w:spacing w:after="180" w:before="0" w:lineRule="auto"/>
         <w:ind w:left="360" w:hanging="360"/>
         <w:rPr/>
@@ -1044,13 +1119,13 @@
           <w:bCs w:val="1"/>
           <w:rtl w:val="0"/>
         </w:rPr>
-        <w:t xml:space="preserve">Raspagem de perfil</w:t>
-      </w:r>
-      <w:r>
-        <w:rPr>
-          <w:rtl w:val="0"/>
-        </w:rPr>
-        <w:t xml:space="preserve"> — US$ 0,022 por perfil.</w:t>
+        <w:t xml:space="preserve">Locução</w:t>
+      </w:r>
+      <w:r>
+        <w:rPr>
+          <w:rtl w:val="0"/>
+        </w:rPr>
+        <w:t xml:space="preserve"> — US$ 0,019 por minuto, estimado.</w:t>
       </w:r>
     </w:p>
     <w:p>
@@ -1073,7 +1148,7 @@
         <w:rPr>
           <w:rtl w:val="0"/>
         </w:rPr>
-        <w:t xml:space="preserve"> A conversa do bot é dois terços disso. Nos meses seguintes, menos de 3 centavos de dólar por mês.</w:t>
+        <w:t xml:space="preserve"> A conversa do bot é dois terços disso. Com os doze anúncios do mês, o cliente fica em US$ 1,41 no primeiro mês e US$ 1,09 nos seguintes — ou R$ 7,70 e R$ 5,90. A imagem é 97% da conta recorrente; o onboarding, que parecia o gasto principal, equivale a quatro anúncios.</w:t>
       </w:r>
     </w:p>
     <w:p>
@@ -1270,116 +1345,6 @@
           <w:rtl w:val="0"/>
         </w:rPr>
         <w:t xml:space="preserve">A medição encontrou uma etapa morta. A análise que escolhe a área livre para o texto tinha parado de funcionar em silêncio: o modelo que ela usava foi aposentado pelo Google e a chamada passou a falhar sem avisar, então os primeiros 22 anúncios saíram com o texto posicionado no escuro. Foi o próprio registro de consumo que denunciou — um modelo que o código chama e que nunca aparecia na conta. Corrigida em 7 de agosto: a etapa voltou, custa US$ 0,0097 por anúncio e levou o total de US$ 0,082 para US$ 0,088. Os dois valores são medidos.</w:t>
-      </w:r>
-    </w:p>
-    <w:p>
-      <w:pPr>
-        <w:pStyle w:val="Heading2"/>
-        <w:spacing w:after="120" w:before="200" w:lineRule="auto"/>
-        <w:rPr/>
-      </w:pPr>
-      <w:r>
-        <w:rPr>
-          <w:rtl w:val="0"/>
-        </w:rPr>
-        <w:t xml:space="preserve">O total por cliente</w:t>
-      </w:r>
-    </w:p>
-    <w:p>
-      <w:pPr>
-        <w:spacing w:after="140" w:before="0" w:lineRule="auto"/>
-        <w:rPr/>
-      </w:pPr>
-      <w:r>
-        <w:rPr>
-          <w:rtl w:val="0"/>
-        </w:rPr>
-        <w:t xml:space="preserve">Somando as duas seções acima — as etapas de texto e as de imagem — para um cliente que publica doze posts no mês.</w:t>
-      </w:r>
-    </w:p>
-    <w:p>
-      <w:pPr>
-        <w:numPr>
-          <w:ilvl w:val="0"/>
-          <w:numId w:val="1"/>
-        </w:numPr>
-        <w:spacing w:after="60" w:before="0" w:lineRule="auto"/>
-        <w:ind w:left="360" w:hanging="360"/>
-        <w:rPr/>
-      </w:pPr>
-      <w:r>
-        <w:rPr>
-          <w:b w:val="1"/>
-          <w:bCs w:val="1"/>
-          <w:rtl w:val="0"/>
-        </w:rPr>
-        <w:t xml:space="preserve">Primeiro mês</w:t>
-      </w:r>
-      <w:r>
-        <w:rPr>
-          <w:rtl w:val="0"/>
-        </w:rPr>
-        <w:t xml:space="preserve"> — US$ 1,41, ou R$ 7,70. Entram o onboarding inteiro (US$ 0,35) e os doze anúncios.</w:t>
-      </w:r>
-    </w:p>
-    <w:p>
-      <w:pPr>
-        <w:numPr>
-          <w:ilvl w:val="0"/>
-          <w:numId w:val="1"/>
-        </w:numPr>
-        <w:spacing w:after="180" w:before="0" w:lineRule="auto"/>
-        <w:ind w:left="360" w:hanging="360"/>
-        <w:rPr/>
-      </w:pPr>
-      <w:r>
-        <w:rPr>
-          <w:b w:val="1"/>
-          <w:bCs w:val="1"/>
-          <w:rtl w:val="0"/>
-        </w:rPr>
-        <w:t xml:space="preserve">Meses seguintes</w:t>
-      </w:r>
-      <w:r>
-        <w:rPr>
-          <w:rtl w:val="0"/>
-        </w:rPr>
-        <w:t xml:space="preserve"> — US$ 1,09, ou R$ 5,90. O onboarding não se repete; sobram os anúncios e centavos de texto.</w:t>
-      </w:r>
-    </w:p>
-    <w:p>
-      <w:pPr>
-        <w:pBdr>
-          <w:left w:color="ff5254" w:space="10" w:sz="18" w:val="single"/>
-        </w:pBdr>
-        <w:spacing w:after="200" w:before="80" w:lineRule="auto"/>
-        <w:rPr/>
-      </w:pPr>
-      <w:r>
-        <w:rPr>
-          <w:b w:val="1"/>
-          <w:bCs w:val="1"/>
-          <w:rtl w:val="0"/>
-        </w:rPr>
-        <w:t xml:space="preserve">Um cliente custa menos de dois dólares por mês.</w:t>
-      </w:r>
-      <w:r>
-        <w:rPr>
-          <w:rtl w:val="0"/>
-        </w:rPr>
-        <w:t xml:space="preserve"> Praticamente tudo isso é imagem: 97% da conta recorrente.</w:t>
-      </w:r>
-    </w:p>
-    <w:p>
-      <w:pPr>
-        <w:spacing w:after="140" w:before="0" w:lineRule="auto"/>
-        <w:rPr/>
-      </w:pPr>
-      <w:r>
-        <w:rPr>
-          <w:rtl w:val="0"/>
-        </w:rPr>
-        <w:t xml:space="preserve">O onboarding parecia o gasto principal enquanto a imagem estava de fora da conta. Com ela dentro, ele vira detalhe: paga-se uma vez e equivale a quatro anúncios. O que decide o custo de um cliente é quantos posts ele publica.</w:t>
       </w:r>
     </w:p>
     <w:p>

</xml_diff>

<commit_message>
docs(ad-tests): custo medido com o modelo de imagem premium (run 275)
Job 337 com gemini-3.1-flash-image: US$ 0,134 por anuncio, nao os ~0,116 que eu
tinha projetado. A imagem sozinha custou US$ 0,0881 porque o modelo emitiu 1384
tokens de saida, e o comentario da tabela de precos no codigo assume ~1120 —
logo o premium e +52% sobre o 2.5, nao +32%.

Documento: bullet da lista, fecho da secao (US$ 1,96 no primeiro mes / 1,64 nos
seguintes) e toda a secao de video, que se apoiava no custo do anuncio.

Co-Authored-By: Claude Opus 5 (1M context) <noreply@anthropic.com>
</commit_message>
<xml_diff>
--- a/ad-tests/dados-e-metricas.docx
+++ b/ad-tests/dados-e-metricas.docx
@@ -1075,7 +1075,7 @@
         <w:rPr>
           <w:rtl w:val="0"/>
         </w:rPr>
-        <w:t xml:space="preserve"> — US$ 0,088 por anúncio. Medido.</w:t>
+        <w:t xml:space="preserve"> — US$ 0,134 por anúncio. Medido.</w:t>
       </w:r>
     </w:p>
     <w:p>
@@ -1100,7 +1100,7 @@
         <w:rPr>
           <w:rtl w:val="0"/>
         </w:rPr>
-        <w:t xml:space="preserve"> — US$ 1,01 por vídeo, estimado. Tier Fast do Veo 3.1, áudio incluso.</w:t>
+        <w:t xml:space="preserve"> — US$ 1,06 por vídeo, estimado. Tier Fast do Veo 3.1, áudio incluso.</w:t>
       </w:r>
     </w:p>
     <w:p>
@@ -1148,7 +1148,7 @@
         <w:rPr>
           <w:rtl w:val="0"/>
         </w:rPr>
-        <w:t xml:space="preserve"> A conversa do bot é dois terços disso. Com os doze anúncios do mês, o cliente fica em US$ 1,41 no primeiro mês e US$ 1,09 nos seguintes — ou R$ 7,70 e R$ 5,90. A imagem é 97% da conta recorrente; o onboarding, que parecia o gasto principal, equivale a quatro anúncios.</w:t>
+        <w:t xml:space="preserve"> A conversa do bot é dois terços disso. Com os doze anúncios do mês, o cliente fica em US$ 1,96 no primeiro mês e US$ 1,64 nos seguintes — ou R$ 10,60 e R$ 8,90. A imagem é 98% da conta recorrente; o onboarding, que parecia o gasto principal, equivale a menos de três anúncios.</w:t>
       </w:r>
     </w:p>
     <w:p>
@@ -1185,7 +1185,7 @@
         <w:rPr>
           <w:rtl w:val="0"/>
         </w:rPr>
-        <w:t xml:space="preserve">Base: a Unica, 24 anúncios gerados entre 4 e 7 de agosto de 2026. Consumo lido do nosso próprio registro, não estimativa. Os valores por etapa são do último anúncio, já com a correção descrita mais abaixo.</w:t>
+        <w:t xml:space="preserve">Base: a Unica, 25 anúncios gerados entre 4 e 7 de agosto de 2026. Consumo lido do nosso próprio registro, não estimativa. Os valores por etapa são do último anúncio, já com o modelo de imagem premium e com a correção descrita mais abaixo.</w:t>
       </w:r>
     </w:p>
     <w:p>
@@ -1210,7 +1210,7 @@
         <w:rPr>
           <w:rtl w:val="0"/>
         </w:rPr>
-        <w:t xml:space="preserve"> — US$ 0,0418 por anúncio. Metade do custo, numa única chamada.</w:t>
+        <w:t xml:space="preserve"> — US$ 0,0881 por anúncio. Dois terços do custo, numa única chamada.</w:t>
       </w:r>
     </w:p>
     <w:p>
@@ -1235,7 +1235,7 @@
         <w:rPr>
           <w:rtl w:val="0"/>
         </w:rPr>
-        <w:t xml:space="preserve"> — US$ 0,0287 por anúncio. Um terço do custo.</w:t>
+        <w:t xml:space="preserve"> — US$ 0,0287 por anúncio.</w:t>
       </w:r>
     </w:p>
     <w:p>
@@ -1260,7 +1260,7 @@
         <w:rPr>
           <w:rtl w:val="0"/>
         </w:rPr>
-        <w:t xml:space="preserve"> — US$ 0,0097 por anúncio.</w:t>
+        <w:t xml:space="preserve"> — US$ 0,0089 por anúncio.</w:t>
       </w:r>
     </w:p>
     <w:p>
@@ -1285,7 +1285,7 @@
         <w:rPr>
           <w:rtl w:val="0"/>
         </w:rPr>
-        <w:t xml:space="preserve"> — US$ 0,0079 por anúncio, divididos em cinco chamadas.</w:t>
+        <w:t xml:space="preserve"> — US$ 0,0086 por anúncio, divididos em cinco chamadas.</w:t>
       </w:r>
     </w:p>
     <w:p>
@@ -1302,13 +1302,13 @@
           <w:bCs w:val="1"/>
           <w:rtl w:val="0"/>
         </w:rPr>
-        <w:t xml:space="preserve">Um anúncio custa US$ 0,088, ou R$ 0,48.</w:t>
-      </w:r>
-      <w:r>
-        <w:rPr>
-          <w:rtl w:val="0"/>
-        </w:rPr>
-        <w:t xml:space="preserve"> A faixa observada vai de US$ 0,074 a US$ 0,090.</w:t>
+        <w:t xml:space="preserve">Um anúncio custa US$ 0,134, ou R$ 0,73.</w:t>
+      </w:r>
+      <w:r>
+        <w:rPr>
+          <w:rtl w:val="0"/>
+        </w:rPr>
+        <w:t xml:space="preserve"> Doze posts no mês dão US$ 1,61, ou R$ 8,70 por cliente.</w:t>
       </w:r>
     </w:p>
     <w:p>
@@ -1320,7 +1320,7 @@
         <w:rPr>
           <w:rtl w:val="0"/>
         </w:rPr>
-        <w:t xml:space="preserve">Doze posts no mês dão US$ 1,06, ou R$ 5,70 por cliente. É trinta e cinco vezes tudo o que o cliente gasta em texto no mesmo mês, e o único custo que cresce com o volume de posts.</w:t>
+        <w:t xml:space="preserve">Quem manda no custo é o modelo de imagem. Em 7 de agosto ele voltou para o premium, e o anúncio subiu de US$ 0,088 para US$ 0,134 — mais da metade. Trocar de modelo é um comando e um redeploy, então esse número é uma escolha, não um dado fixo: o modelo anterior entrega o anúncio por dois terços do preço, com menos nitidez.</w:t>
       </w:r>
     </w:p>
     <w:p>
@@ -1332,7 +1332,7 @@
         <w:rPr>
           <w:rtl w:val="0"/>
         </w:rPr>
-        <w:t xml:space="preserve">Entender a imagem de referência custa quase o mesmo que gerar a imagem final. Todo anúncio da Unica foi gerado com referência; sem ela o anúncio cairia para cerca de US$ 0,06. Vale medir antes de decidir se a referência é obrigatória.</w:t>
+        <w:t xml:space="preserve">Entender a imagem de referência custa US$ 0,0287, mais que copy, tema e diagramação somados. Todo anúncio da Unica foi gerado com referência; sem ela o anúncio cairia para cerca de US$ 0,11. Vale medir antes de decidir se a referência é obrigatória.</w:t>
       </w:r>
     </w:p>
     <w:p>
@@ -1344,7 +1344,7 @@
         <w:rPr>
           <w:rtl w:val="0"/>
         </w:rPr>
-        <w:t xml:space="preserve">A medição encontrou uma etapa morta. A análise que escolhe a área livre para o texto tinha parado de funcionar em silêncio: o modelo que ela usava foi aposentado pelo Google e a chamada passou a falhar sem avisar, então os primeiros 22 anúncios saíram com o texto posicionado no escuro. Foi o próprio registro de consumo que denunciou — um modelo que o código chama e que nunca aparecia na conta. Corrigida em 7 de agosto: a etapa voltou, custa US$ 0,0097 por anúncio e levou o total de US$ 0,082 para US$ 0,088. Os dois valores são medidos.</w:t>
+        <w:t xml:space="preserve">A medição encontrou uma etapa morta. A análise que escolhe a área livre para o texto tinha parado de funcionar em silêncio: o modelo que ela usava foi aposentado pelo Google e a chamada passou a falhar sem avisar, então os primeiros 22 anúncios saíram com o texto posicionado no escuro. Foi o próprio registro de consumo que denunciou — um modelo que o código chama e que nunca aparecia na conta. Corrigida em 7 de agosto por menos de um centavo por anúncio, e o efeito é visível: a headline saiu de cima das pessoas e foi para a faixa vazia do topo. Sem esse registro, ninguém teria percebido.</w:t>
       </w:r>
     </w:p>
     <w:p>
@@ -1419,7 +1419,7 @@
         <w:rPr>
           <w:rtl w:val="0"/>
         </w:rPr>
-        <w:t xml:space="preserve"> — US$ 0,05 por vídeo. É o mesmo pipeline do anúncio.</w:t>
+        <w:t xml:space="preserve"> — US$ 0,10 por vídeo. É o mesmo pipeline do anúncio.</w:t>
       </w:r>
     </w:p>
     <w:p>
@@ -1461,13 +1461,13 @@
           <w:bCs w:val="1"/>
           <w:rtl w:val="0"/>
         </w:rPr>
-        <w:t xml:space="preserve">Um vídeo de 8 segundos equivale a oito anúncios no tier barato e a quase quarenta no caro.</w:t>
-      </w:r>
-      <w:r>
-        <w:rPr>
-          <w:rtl w:val="0"/>
-        </w:rPr>
-        <w:t xml:space="preserve"> No Fast, doze.</w:t>
+        <w:t xml:space="preserve">Um vídeo de 8 segundos equivale a cinco anúncios no tier barato e a vinte e cinco no caro.</w:t>
+      </w:r>
+      <w:r>
+        <w:rPr>
+          <w:rtl w:val="0"/>
+        </w:rPr>
+        <w:t xml:space="preserve"> No Fast, oito.</w:t>
       </w:r>
     </w:p>
     <w:p>
@@ -1479,7 +1479,7 @@
         <w:rPr>
           <w:rtl w:val="0"/>
         </w:rPr>
-        <w:t xml:space="preserve">Se quatro dos doze posts do mês virarem vídeo, o cliente sai de US$ 1,06 para US$ 3,50 no Lite, US$ 4,70 no Fast e US$ 13,70 no Standard. Áudio não move o ponteiro: quatro locuções de 30 segundos custam 4 centavos. Vídeo é o único item capaz de mudar a ordem de grandeza do custo por cliente.</w:t>
+        <w:t xml:space="preserve">Se quatro dos doze posts do mês virarem vídeo, o cliente sai de US$ 1,61 para US$ 4,00 no Lite, US$ 5,30 no Fast e US$ 14,30 no Standard. Áudio não move o ponteiro: quatro locuções de 30 segundos custam 4 centavos. Vídeo é o único item capaz de mudar a ordem de grandeza do custo por cliente.</w:t>
       </w:r>
     </w:p>
     <w:p>

</xml_diff>